<commit_message>
Add Hausa language directory to translation guide
</commit_message>
<xml_diff>
--- a/eng/docx/18.content.docx
+++ b/eng/docx/18.content.docx
@@ -1247,18 +1247,12 @@
         </w:rPr>
         <w:t xml:space="preserve">. The fear of God is an Old Testament expression that refers to the act of living with constant awareness of God's control over the world and over a person's life. For more information about fear or </w:t>
       </w:r>
-      <w:hyperlink r:id="rId13">
-        <w:r>
-          <w:rPr>
-            <w:lang w:val="en_US" w:bidi="en_US"/>
-          </w:rPr>
-          <w:rPr>
-            <w:color w:val="0000EE"/>
-            <w:u w:val="single"/>
-          </w:rPr>
-          <w:t>fear of God</w:t>
-        </w:r>
-      </w:hyperlink>
+      <w:r>
+        <w:rPr>
+          <w:lang w:val="en_US" w:bidi="en_US"/>
+        </w:rPr>
+        <w:t>fear of God</w:t>
+      </w:r>
       <w:r>
         <w:rPr>
           <w:lang w:val="en_US" w:bidi="en_US"/>
@@ -1346,18 +1340,12 @@
         </w:rPr>
         <w:t xml:space="preserve"> to God for each of his sons. Burnt offering is a ritual that involves the killing and the burning of an animal sacrifice. It is offered for various reasons, such as when a person wants to thank God or ask God for something. Another reason is to ask God for forgiveness of sins. In the story, this was Job's reason for the burnt offerings. For more information about </w:t>
       </w:r>
-      <w:hyperlink r:id="rId14">
-        <w:r>
-          <w:rPr>
-            <w:lang w:val="en_US" w:bidi="en_US"/>
-          </w:rPr>
-          <w:rPr>
-            <w:color w:val="0000EE"/>
-            <w:u w:val="single"/>
-          </w:rPr>
-          <w:t>burnt offering</w:t>
-        </w:r>
-      </w:hyperlink>
+      <w:r>
+        <w:rPr>
+          <w:lang w:val="en_US" w:bidi="en_US"/>
+        </w:rPr>
+        <w:t>burnt offering</w:t>
+      </w:r>
       <w:r>
         <w:rPr>
           <w:lang w:val="en_US" w:bidi="en_US"/>
@@ -1390,36 +1378,24 @@
         </w:rPr>
         <w:t xml:space="preserve">. Sin means disobedience to God. Cursing is when a person wishes for something unpleasant to happen to another person. Cursing God in the heart is when a person has evil thoughts against God. You may refer to the Master Glossary for more information about </w:t>
       </w:r>
-      <w:hyperlink r:id="rId15">
-        <w:r>
-          <w:rPr>
-            <w:lang w:val="en_US" w:bidi="en_US"/>
-          </w:rPr>
-          <w:rPr>
-            <w:color w:val="0000EE"/>
-            <w:u w:val="single"/>
-          </w:rPr>
-          <w:t>sin</w:t>
-        </w:r>
-      </w:hyperlink>
+      <w:r>
+        <w:rPr>
+          <w:lang w:val="en_US" w:bidi="en_US"/>
+        </w:rPr>
+        <w:t>sin</w:t>
+      </w:r>
       <w:r>
         <w:rPr>
           <w:lang w:val="en_US" w:bidi="en_US"/>
         </w:rPr>
         <w:t xml:space="preserve"> and </w:t>
       </w:r>
-      <w:hyperlink r:id="rId16">
-        <w:r>
-          <w:rPr>
-            <w:lang w:val="en_US" w:bidi="en_US"/>
-          </w:rPr>
-          <w:rPr>
-            <w:color w:val="0000EE"/>
-            <w:u w:val="single"/>
-          </w:rPr>
-          <w:t>curse</w:t>
-        </w:r>
-      </w:hyperlink>
+      <w:r>
+        <w:rPr>
+          <w:lang w:val="en_US" w:bidi="en_US"/>
+        </w:rPr>
+        <w:t>curse</w:t>
+      </w:r>
       <w:r>
         <w:rPr>
           <w:lang w:val="en_US" w:bidi="en_US"/>
@@ -2378,38 +2354,14 @@
         <w:rPr>
           <w:lang w:val="en_US" w:bidi="en_US"/>
         </w:rPr>
-        <w:t xml:space="preserve">, that were servants of God. As God had human servants, God had spirit servants as well. This shows that God is king in both heaven and on earth. It shows his power and control over everything that happens in the world. God's spirit servants were called sons of God. As servants, God gave them work to do and they were required to present themselves before God, or to report the progress of their work to God. You may refer to the Master Glossary for more information about </w:t>
-      </w:r>
-      <w:hyperlink r:id="rId17">
-        <w:r>
-          <w:rPr>
-            <w:lang w:val="en_US" w:bidi="en_US"/>
-          </w:rPr>
-          <w:rPr>
-            <w:color w:val="0000EE"/>
-            <w:u w:val="single"/>
-          </w:rPr>
-          <w:t>sons of God</w:t>
-        </w:r>
-      </w:hyperlink>
-      <w:r>
-        <w:rPr>
-          <w:lang w:val="en_US" w:bidi="en_US"/>
-        </w:rPr>
-        <w:t xml:space="preserve"> or </w:t>
-      </w:r>
-      <w:hyperlink r:id="rId18">
-        <w:r>
-          <w:rPr>
-            <w:lang w:val="en_US" w:bidi="en_US"/>
-          </w:rPr>
-          <w:rPr>
-            <w:color w:val="0000EE"/>
-            <w:u w:val="single"/>
-          </w:rPr>
-          <w:t>angels</w:t>
-        </w:r>
-      </w:hyperlink>
+        <w:t xml:space="preserve">, that were servants of God. As God had human servants, God had spirit servants as well. This shows that God is king in both heaven and on earth. It shows his power and control over everything that happens in the world. God's spirit servants were called sons of God. As servants, God gave them work to do and they were required to present themselves before God, or to report the progress of their work to God. You may refer to the Master Glossary for more information about sons of God or </w:t>
+      </w:r>
+      <w:r>
+        <w:rPr>
+          <w:lang w:val="en_US" w:bidi="en_US"/>
+        </w:rPr>
+        <w:t>angels</w:t>
+      </w:r>
       <w:r>
         <w:rPr>
           <w:lang w:val="en_US" w:bidi="en_US"/>
@@ -2442,18 +2394,12 @@
         </w:rPr>
         <w:t xml:space="preserve">, the personal name for God, except for the word "sons of God" and except when God and Satan will mention the word, "God." Your team should translate the personal name of God, Yahweh, in the same way you have in other stories and remember that </w:t>
       </w:r>
-      <w:hyperlink r:id="rId19">
-        <w:r>
-          <w:rPr>
-            <w:lang w:val="en_US" w:bidi="en_US"/>
-          </w:rPr>
-          <w:rPr>
-            <w:color w:val="0000EE"/>
-            <w:u w:val="single"/>
-          </w:rPr>
-          <w:t>Yahweh</w:t>
-        </w:r>
-      </w:hyperlink>
+      <w:r>
+        <w:rPr>
+          <w:lang w:val="en_US" w:bidi="en_US"/>
+        </w:rPr>
+        <w:t>Yahweh</w:t>
+      </w:r>
       <w:r>
         <w:rPr>
           <w:lang w:val="en_US" w:bidi="en_US"/>
@@ -2481,18 +2427,12 @@
         </w:rPr>
         <w:t xml:space="preserve"> also came to present himself. In the Hebrew, "Satan" means enemy or accuser. It is not a person's name. Rather, it is a title that is associated with the work that God assigned him. His main job is to challenge or test people to see if they really love and obey God. You may call this character either as "Satan the accuser" or just "the accuser." For more information about </w:t>
       </w:r>
-      <w:hyperlink r:id="rId20">
-        <w:r>
-          <w:rPr>
-            <w:lang w:val="en_US" w:bidi="en_US"/>
-          </w:rPr>
-          <w:rPr>
-            <w:color w:val="0000EE"/>
-            <w:u w:val="single"/>
-          </w:rPr>
-          <w:t>Satan</w:t>
-        </w:r>
-      </w:hyperlink>
+      <w:r>
+        <w:rPr>
+          <w:lang w:val="en_US" w:bidi="en_US"/>
+        </w:rPr>
+        <w:t>Satan</w:t>
+      </w:r>
       <w:r>
         <w:rPr>
           <w:lang w:val="en_US" w:bidi="en_US"/>
@@ -2565,18 +2505,12 @@
         </w:rPr>
         <w:t xml:space="preserve">. The fear of God is an Old Testament expression that refers to the act of living with constant awareness of God's control over the world and over a person's life. For more information about fear or </w:t>
       </w:r>
-      <w:hyperlink r:id="rId13">
-        <w:r>
-          <w:rPr>
-            <w:lang w:val="en_US" w:bidi="en_US"/>
-          </w:rPr>
-          <w:rPr>
-            <w:color w:val="0000EE"/>
-            <w:u w:val="single"/>
-          </w:rPr>
-          <w:t>fear of God</w:t>
-        </w:r>
-      </w:hyperlink>
+      <w:r>
+        <w:rPr>
+          <w:lang w:val="en_US" w:bidi="en_US"/>
+        </w:rPr>
+        <w:t>fear of God</w:t>
+      </w:r>
       <w:r>
         <w:rPr>
           <w:lang w:val="en_US" w:bidi="en_US"/>
@@ -2610,18 +2544,12 @@
         </w:rPr>
         <w:t xml:space="preserve">. Cursing is when a person wishes for something unpleasant to happen to another person. Cursing God to his face is when a person speaks words or has thoughts that are against God. You may refer to the Master Glossary for more information about the word </w:t>
       </w:r>
-      <w:hyperlink r:id="rId16">
-        <w:r>
-          <w:rPr>
-            <w:lang w:val="en_US" w:bidi="en_US"/>
-          </w:rPr>
-          <w:rPr>
-            <w:color w:val="0000EE"/>
-            <w:u w:val="single"/>
-          </w:rPr>
-          <w:t>curse</w:t>
-        </w:r>
-      </w:hyperlink>
+      <w:r>
+        <w:rPr>
+          <w:lang w:val="en_US" w:bidi="en_US"/>
+        </w:rPr>
+        <w:t>curse</w:t>
+      </w:r>
       <w:r>
         <w:rPr>
           <w:lang w:val="en_US" w:bidi="en_US"/>
@@ -3909,18 +3837,12 @@
         </w:rPr>
         <w:t xml:space="preserve"> God. Worship to God refers to the act of bowing to the ground and praising God for his greatness. You may refer to the Master Glossary for more information about the word, </w:t>
       </w:r>
-      <w:hyperlink r:id="rId21">
-        <w:r>
-          <w:rPr>
-            <w:lang w:val="en_US" w:bidi="en_US"/>
-          </w:rPr>
-          <w:rPr>
-            <w:color w:val="0000EE"/>
-            <w:u w:val="single"/>
-          </w:rPr>
-          <w:t>worship</w:t>
-        </w:r>
-      </w:hyperlink>
+      <w:r>
+        <w:rPr>
+          <w:lang w:val="en_US" w:bidi="en_US"/>
+        </w:rPr>
+        <w:t>worship</w:t>
+      </w:r>
       <w:r>
         <w:rPr>
           <w:lang w:val="en_US" w:bidi="en_US"/>
@@ -3940,54 +3862,36 @@
         </w:rPr>
         <w:t xml:space="preserve"> the name of Lord. Remember that the word </w:t>
       </w:r>
-      <w:hyperlink r:id="rId22">
-        <w:r>
-          <w:rPr>
-            <w:lang w:val="en_US" w:bidi="en_US"/>
-          </w:rPr>
-          <w:rPr>
-            <w:color w:val="0000EE"/>
-            <w:u w:val="single"/>
-          </w:rPr>
-          <w:t>bless</w:t>
-        </w:r>
-      </w:hyperlink>
+      <w:r>
+        <w:rPr>
+          <w:lang w:val="en_US" w:bidi="en_US"/>
+        </w:rPr>
+        <w:t>bless</w:t>
+      </w:r>
       <w:r>
         <w:rPr>
           <w:lang w:val="en_US" w:bidi="en_US"/>
         </w:rPr>
         <w:t xml:space="preserve"> here is also in the Master Glossary. The word Lord here refers to Yahweh, God's personal name. You may refer to the Master Glossary for more information about the words for </w:t>
       </w:r>
-      <w:hyperlink r:id="rId23">
-        <w:r>
-          <w:rPr>
-            <w:lang w:val="en_US" w:bidi="en_US"/>
-          </w:rPr>
-          <w:rPr>
-            <w:color w:val="0000EE"/>
-            <w:u w:val="single"/>
-          </w:rPr>
-          <w:t>God</w:t>
-        </w:r>
-      </w:hyperlink>
+      <w:r>
+        <w:rPr>
+          <w:lang w:val="en_US" w:bidi="en_US"/>
+        </w:rPr>
+        <w:t>God</w:t>
+      </w:r>
       <w:r>
         <w:rPr>
           <w:lang w:val="en_US" w:bidi="en_US"/>
         </w:rPr>
         <w:t xml:space="preserve"> and </w:t>
       </w:r>
-      <w:hyperlink r:id="rId19">
-        <w:r>
-          <w:rPr>
-            <w:lang w:val="en_US" w:bidi="en_US"/>
-          </w:rPr>
-          <w:rPr>
-            <w:color w:val="0000EE"/>
-            <w:u w:val="single"/>
-          </w:rPr>
-          <w:t>Yahweh</w:t>
-        </w:r>
-      </w:hyperlink>
+      <w:r>
+        <w:rPr>
+          <w:lang w:val="en_US" w:bidi="en_US"/>
+        </w:rPr>
+        <w:t>Yahweh</w:t>
+      </w:r>
       <w:r>
         <w:rPr>
           <w:lang w:val="en_US" w:bidi="en_US"/>
@@ -4021,18 +3925,12 @@
         </w:rPr>
         <w:t xml:space="preserve">, or disobey God. Job also did not speak any evil word against God or blame him for all the things he lost. You may refer to the Master Glossary for more information about </w:t>
       </w:r>
-      <w:hyperlink r:id="rId15">
-        <w:r>
-          <w:rPr>
-            <w:lang w:val="en_US" w:bidi="en_US"/>
-          </w:rPr>
-          <w:rPr>
-            <w:color w:val="0000EE"/>
-            <w:u w:val="single"/>
-          </w:rPr>
-          <w:t>sin</w:t>
-        </w:r>
-      </w:hyperlink>
+      <w:r>
+        <w:rPr>
+          <w:lang w:val="en_US" w:bidi="en_US"/>
+        </w:rPr>
+        <w:t>sin</w:t>
+      </w:r>
       <w:r>
         <w:rPr>
           <w:lang w:val="en_US" w:bidi="en_US"/>
@@ -5078,18 +4976,12 @@
         </w:rPr>
         <w:t xml:space="preserve">, God's personal name except for the word "Son of God" and except for when God refers to himself. Your team should translate the personal name of God, Yahweh, in the same way you have in other stories and remember that </w:t>
       </w:r>
-      <w:hyperlink r:id="rId19">
-        <w:r>
-          <w:rPr>
-            <w:lang w:val="en_US" w:bidi="en_US"/>
-          </w:rPr>
-          <w:rPr>
-            <w:color w:val="0000EE"/>
-            <w:u w:val="single"/>
-          </w:rPr>
-          <w:t>Yahweh</w:t>
-        </w:r>
-      </w:hyperlink>
+      <w:r>
+        <w:rPr>
+          <w:lang w:val="en_US" w:bidi="en_US"/>
+        </w:rPr>
+        <w:t>Yahweh</w:t>
+      </w:r>
       <w:r>
         <w:rPr>
           <w:lang w:val="en_US" w:bidi="en_US"/>
@@ -5117,18 +5009,12 @@
         </w:rPr>
         <w:t xml:space="preserve"> also came to present himself. In the Hebrew, Satan means enemy or accuser. Remember to translate it the way you have translated it in the previous passage. For more information about </w:t>
       </w:r>
-      <w:hyperlink r:id="rId20">
-        <w:r>
-          <w:rPr>
-            <w:lang w:val="en_US" w:bidi="en_US"/>
-          </w:rPr>
-          <w:rPr>
-            <w:color w:val="0000EE"/>
-            <w:u w:val="single"/>
-          </w:rPr>
-          <w:t>Satan</w:t>
-        </w:r>
-      </w:hyperlink>
+      <w:r>
+        <w:rPr>
+          <w:lang w:val="en_US" w:bidi="en_US"/>
+        </w:rPr>
+        <w:t>Satan</w:t>
+      </w:r>
       <w:r>
         <w:rPr>
           <w:lang w:val="en_US" w:bidi="en_US"/>
@@ -5255,18 +5141,12 @@
         </w:rPr>
         <w:t xml:space="preserve">." Satan was telling God to inflict harm on Job's body so that Job would curse God. Cursing is when a person wishes for something unpleasant to happen to another person. Cursing God to his face is when a person speaks words or has thoughts that are against God. You may refer to the Master Glossary for more information about </w:t>
       </w:r>
-      <w:hyperlink r:id="rId16">
-        <w:r>
-          <w:rPr>
-            <w:lang w:val="en_US" w:bidi="en_US"/>
-          </w:rPr>
-          <w:rPr>
-            <w:color w:val="0000EE"/>
-            <w:u w:val="single"/>
-          </w:rPr>
-          <w:t>curse</w:t>
-        </w:r>
-      </w:hyperlink>
+      <w:r>
+        <w:rPr>
+          <w:lang w:val="en_US" w:bidi="en_US"/>
+        </w:rPr>
+        <w:t>curse</w:t>
+      </w:r>
       <w:r>
         <w:rPr>
           <w:lang w:val="en_US" w:bidi="en_US"/>
@@ -6538,18 +6418,12 @@
         </w:rPr>
         <w:t xml:space="preserve"> so that God will kill him. Cursing is when a person wishes for something unpleasant to happen to another person. Cursing God is when a person speaks words or has thoughts that are against God. You may refer to the Master Glossary for more information about </w:t>
       </w:r>
-      <w:hyperlink r:id="rId16">
-        <w:r>
-          <w:rPr>
-            <w:lang w:val="en_US" w:bidi="en_US"/>
-          </w:rPr>
-          <w:rPr>
-            <w:color w:val="0000EE"/>
-            <w:u w:val="single"/>
-          </w:rPr>
-          <w:t>curse</w:t>
-        </w:r>
-      </w:hyperlink>
+      <w:r>
+        <w:rPr>
+          <w:lang w:val="en_US" w:bidi="en_US"/>
+        </w:rPr>
+        <w:t>curse</w:t>
+      </w:r>
       <w:r>
         <w:rPr>
           <w:lang w:val="en_US" w:bidi="en_US"/>

</xml_diff>

<commit_message>
Update Bible resource data for 2026-10-05 release
</commit_message>
<xml_diff>
--- a/eng/docx/18.content.docx
+++ b/eng/docx/18.content.docx
@@ -1429,6 +1429,236 @@
         <w:rPr>
           <w:lang w:val="en_US" w:bidi="en_US"/>
         </w:rPr>
+        <w:t>Job 1:1–5</w:t>
+      </w:r>
+      <w:r>
+        <w:rPr>
+          <w:lang w:val="en_US" w:bidi="en_US"/>
+        </w:rPr>
+      </w:r>
+    </w:p>
+    <w:p>
+      <w:pPr>
+        <w:pStyle w:val="Heading4"/>
+      </w:pPr>
+      <w:r>
+        <w:rPr>
+          <w:lang w:val="en_US" w:bidi="en_US"/>
+        </w:rPr>
+        <w:t>Audio Content</w:t>
+      </w:r>
+      <w:r>
+        <w:rPr>
+          <w:lang w:val="en_US" w:bidi="en_US"/>
+        </w:rPr>
+      </w:r>
+      <w:r>
+        <w:rPr>
+          <w:lang w:val="en_US" w:bidi="en_US"/>
+        </w:rPr>
+      </w:r>
+    </w:p>
+    <w:p>
+      <w:pPr>
+        <w:pStyle w:val="ListBullet"/>
+        <w:spacing w:line="240" w:lineRule="auto"/>
+        <w:ind w:left="720"/>
+      </w:pPr>
+      <w:r>
+        <w:rPr>
+          <w:lang w:val="en_US" w:bidi="en_US"/>
+        </w:rPr>
+      </w:r>
+      <w:hyperlink r:id="rId13">
+        <w:r>
+          <w:rPr>
+            <w:lang w:val="en_US" w:bidi="en_US"/>
+          </w:rPr>
+          <w:rPr>
+            <w:color w:val="0000EE"/>
+            <w:u w:val="single"/>
+          </w:rPr>
+          <w:t>Hear and Heart</w:t>
+        </w:r>
+      </w:hyperlink>
+      <w:r>
+        <w:rPr>
+          <w:lang w:val="en_US" w:bidi="en_US"/>
+        </w:rPr>
+        <w:t xml:space="preserve"> (302 KB)</w:t>
+      </w:r>
+      <w:r>
+        <w:rPr>
+          <w:lang w:val="en_US" w:bidi="en_US"/>
+        </w:rPr>
+      </w:r>
+    </w:p>
+    <w:p>
+      <w:pPr>
+        <w:pStyle w:val="ListBullet"/>
+        <w:spacing w:line="240" w:lineRule="auto"/>
+        <w:ind w:left="720"/>
+      </w:pPr>
+      <w:r>
+        <w:rPr>
+          <w:lang w:val="en_US" w:bidi="en_US"/>
+        </w:rPr>
+      </w:r>
+      <w:hyperlink r:id="rId14">
+        <w:r>
+          <w:rPr>
+            <w:lang w:val="en_US" w:bidi="en_US"/>
+          </w:rPr>
+          <w:rPr>
+            <w:color w:val="0000EE"/>
+            <w:u w:val="single"/>
+          </w:rPr>
+          <w:t>Setting the Stage</w:t>
+        </w:r>
+      </w:hyperlink>
+      <w:r>
+        <w:rPr>
+          <w:lang w:val="en_US" w:bidi="en_US"/>
+        </w:rPr>
+        <w:t xml:space="preserve"> (1.4 MB)</w:t>
+      </w:r>
+      <w:r>
+        <w:rPr>
+          <w:lang w:val="en_US" w:bidi="en_US"/>
+        </w:rPr>
+      </w:r>
+    </w:p>
+    <w:p>
+      <w:pPr>
+        <w:pStyle w:val="ListBullet"/>
+        <w:spacing w:line="240" w:lineRule="auto"/>
+        <w:ind w:left="720"/>
+      </w:pPr>
+      <w:r>
+        <w:rPr>
+          <w:lang w:val="en_US" w:bidi="en_US"/>
+        </w:rPr>
+      </w:r>
+      <w:hyperlink r:id="rId15">
+        <w:r>
+          <w:rPr>
+            <w:lang w:val="en_US" w:bidi="en_US"/>
+          </w:rPr>
+          <w:rPr>
+            <w:color w:val="0000EE"/>
+            <w:u w:val="single"/>
+          </w:rPr>
+          <w:t>Defining the Scenes</w:t>
+        </w:r>
+      </w:hyperlink>
+      <w:r>
+        <w:rPr>
+          <w:lang w:val="en_US" w:bidi="en_US"/>
+        </w:rPr>
+        <w:t xml:space="preserve"> (1.3 MB)</w:t>
+      </w:r>
+      <w:r>
+        <w:rPr>
+          <w:lang w:val="en_US" w:bidi="en_US"/>
+        </w:rPr>
+      </w:r>
+    </w:p>
+    <w:p>
+      <w:pPr>
+        <w:pStyle w:val="ListBullet"/>
+        <w:spacing w:line="240" w:lineRule="auto"/>
+        <w:ind w:left="720"/>
+      </w:pPr>
+      <w:r>
+        <w:rPr>
+          <w:lang w:val="en_US" w:bidi="en_US"/>
+        </w:rPr>
+      </w:r>
+      <w:hyperlink r:id="rId16">
+        <w:r>
+          <w:rPr>
+            <w:lang w:val="en_US" w:bidi="en_US"/>
+          </w:rPr>
+          <w:rPr>
+            <w:color w:val="0000EE"/>
+            <w:u w:val="single"/>
+          </w:rPr>
+          <w:t>Embodying the Text</w:t>
+        </w:r>
+      </w:hyperlink>
+      <w:r>
+        <w:rPr>
+          <w:lang w:val="en_US" w:bidi="en_US"/>
+        </w:rPr>
+        <w:t xml:space="preserve"> (1.0 MB)</w:t>
+      </w:r>
+      <w:r>
+        <w:rPr>
+          <w:lang w:val="en_US" w:bidi="en_US"/>
+        </w:rPr>
+      </w:r>
+    </w:p>
+    <w:p>
+      <w:pPr>
+        <w:pStyle w:val="ListBullet"/>
+        <w:spacing w:line="240" w:lineRule="auto"/>
+        <w:ind w:left="720"/>
+      </w:pPr>
+      <w:r>
+        <w:rPr>
+          <w:lang w:val="en_US" w:bidi="en_US"/>
+        </w:rPr>
+      </w:r>
+      <w:hyperlink r:id="rId17">
+        <w:r>
+          <w:rPr>
+            <w:lang w:val="en_US" w:bidi="en_US"/>
+          </w:rPr>
+          <w:rPr>
+            <w:color w:val="0000EE"/>
+            <w:u w:val="single"/>
+          </w:rPr>
+          <w:t>Filling the Gaps</w:t>
+        </w:r>
+      </w:hyperlink>
+      <w:r>
+        <w:rPr>
+          <w:lang w:val="en_US" w:bidi="en_US"/>
+        </w:rPr>
+        <w:t xml:space="preserve"> (1.3 MB)</w:t>
+      </w:r>
+      <w:r>
+        <w:rPr>
+          <w:lang w:val="en_US" w:bidi="en_US"/>
+        </w:rPr>
+      </w:r>
+      <w:r>
+        <w:rPr>
+          <w:lang w:val="en_US" w:bidi="en_US"/>
+        </w:rPr>
+      </w:r>
+      <w:r>
+        <w:rPr>
+          <w:lang w:val="en_US" w:bidi="en_US"/>
+        </w:rPr>
+      </w:r>
+    </w:p>
+    <w:p>
+      <w:pPr/>
+      <w:r>
+        <w:rPr>
+          <w:lang w:val="en_US" w:bidi="en_US"/>
+        </w:rPr>
+      </w:r>
+    </w:p>
+    <w:p>
+      <w:pPr>
+        <w:pStyle w:val="Heading2"/>
+      </w:pPr>
+      <w:r>
+        <w:rPr>
+          <w:lang w:val="en_US" w:bidi="en_US"/>
+        </w:rPr>
         <w:t>Job 1:6–12</w:t>
       </w:r>
       <w:r>
@@ -2610,6 +2840,236 @@
         <w:rPr>
           <w:lang w:val="en_US" w:bidi="en_US"/>
         </w:rPr>
+        <w:t>Job 1:6–12</w:t>
+      </w:r>
+      <w:r>
+        <w:rPr>
+          <w:lang w:val="en_US" w:bidi="en_US"/>
+        </w:rPr>
+      </w:r>
+    </w:p>
+    <w:p>
+      <w:pPr>
+        <w:pStyle w:val="Heading4"/>
+      </w:pPr>
+      <w:r>
+        <w:rPr>
+          <w:lang w:val="en_US" w:bidi="en_US"/>
+        </w:rPr>
+        <w:t>Audio Content</w:t>
+      </w:r>
+      <w:r>
+        <w:rPr>
+          <w:lang w:val="en_US" w:bidi="en_US"/>
+        </w:rPr>
+      </w:r>
+      <w:r>
+        <w:rPr>
+          <w:lang w:val="en_US" w:bidi="en_US"/>
+        </w:rPr>
+      </w:r>
+    </w:p>
+    <w:p>
+      <w:pPr>
+        <w:pStyle w:val="ListBullet"/>
+        <w:spacing w:line="240" w:lineRule="auto"/>
+        <w:ind w:left="720"/>
+      </w:pPr>
+      <w:r>
+        <w:rPr>
+          <w:lang w:val="en_US" w:bidi="en_US"/>
+        </w:rPr>
+      </w:r>
+      <w:hyperlink r:id="rId18">
+        <w:r>
+          <w:rPr>
+            <w:lang w:val="en_US" w:bidi="en_US"/>
+          </w:rPr>
+          <w:rPr>
+            <w:color w:val="0000EE"/>
+            <w:u w:val="single"/>
+          </w:rPr>
+          <w:t>Hear and Heart</w:t>
+        </w:r>
+      </w:hyperlink>
+      <w:r>
+        <w:rPr>
+          <w:lang w:val="en_US" w:bidi="en_US"/>
+        </w:rPr>
+        <w:t xml:space="preserve"> (320 KB)</w:t>
+      </w:r>
+      <w:r>
+        <w:rPr>
+          <w:lang w:val="en_US" w:bidi="en_US"/>
+        </w:rPr>
+      </w:r>
+    </w:p>
+    <w:p>
+      <w:pPr>
+        <w:pStyle w:val="ListBullet"/>
+        <w:spacing w:line="240" w:lineRule="auto"/>
+        <w:ind w:left="720"/>
+      </w:pPr>
+      <w:r>
+        <w:rPr>
+          <w:lang w:val="en_US" w:bidi="en_US"/>
+        </w:rPr>
+      </w:r>
+      <w:hyperlink r:id="rId19">
+        <w:r>
+          <w:rPr>
+            <w:lang w:val="en_US" w:bidi="en_US"/>
+          </w:rPr>
+          <w:rPr>
+            <w:color w:val="0000EE"/>
+            <w:u w:val="single"/>
+          </w:rPr>
+          <w:t>Setting the Stage</w:t>
+        </w:r>
+      </w:hyperlink>
+      <w:r>
+        <w:rPr>
+          <w:lang w:val="en_US" w:bidi="en_US"/>
+        </w:rPr>
+        <w:t xml:space="preserve"> (1.9 MB)</w:t>
+      </w:r>
+      <w:r>
+        <w:rPr>
+          <w:lang w:val="en_US" w:bidi="en_US"/>
+        </w:rPr>
+      </w:r>
+    </w:p>
+    <w:p>
+      <w:pPr>
+        <w:pStyle w:val="ListBullet"/>
+        <w:spacing w:line="240" w:lineRule="auto"/>
+        <w:ind w:left="720"/>
+      </w:pPr>
+      <w:r>
+        <w:rPr>
+          <w:lang w:val="en_US" w:bidi="en_US"/>
+        </w:rPr>
+      </w:r>
+      <w:hyperlink r:id="rId20">
+        <w:r>
+          <w:rPr>
+            <w:lang w:val="en_US" w:bidi="en_US"/>
+          </w:rPr>
+          <w:rPr>
+            <w:color w:val="0000EE"/>
+            <w:u w:val="single"/>
+          </w:rPr>
+          <w:t>Defining the Scenes</w:t>
+        </w:r>
+      </w:hyperlink>
+      <w:r>
+        <w:rPr>
+          <w:lang w:val="en_US" w:bidi="en_US"/>
+        </w:rPr>
+        <w:t xml:space="preserve"> (1.3 MB)</w:t>
+      </w:r>
+      <w:r>
+        <w:rPr>
+          <w:lang w:val="en_US" w:bidi="en_US"/>
+        </w:rPr>
+      </w:r>
+    </w:p>
+    <w:p>
+      <w:pPr>
+        <w:pStyle w:val="ListBullet"/>
+        <w:spacing w:line="240" w:lineRule="auto"/>
+        <w:ind w:left="720"/>
+      </w:pPr>
+      <w:r>
+        <w:rPr>
+          <w:lang w:val="en_US" w:bidi="en_US"/>
+        </w:rPr>
+      </w:r>
+      <w:hyperlink r:id="rId21">
+        <w:r>
+          <w:rPr>
+            <w:lang w:val="en_US" w:bidi="en_US"/>
+          </w:rPr>
+          <w:rPr>
+            <w:color w:val="0000EE"/>
+            <w:u w:val="single"/>
+          </w:rPr>
+          <w:t>Embodying the Text</w:t>
+        </w:r>
+      </w:hyperlink>
+      <w:r>
+        <w:rPr>
+          <w:lang w:val="en_US" w:bidi="en_US"/>
+        </w:rPr>
+        <w:t xml:space="preserve"> (1.1 MB)</w:t>
+      </w:r>
+      <w:r>
+        <w:rPr>
+          <w:lang w:val="en_US" w:bidi="en_US"/>
+        </w:rPr>
+      </w:r>
+    </w:p>
+    <w:p>
+      <w:pPr>
+        <w:pStyle w:val="ListBullet"/>
+        <w:spacing w:line="240" w:lineRule="auto"/>
+        <w:ind w:left="720"/>
+      </w:pPr>
+      <w:r>
+        <w:rPr>
+          <w:lang w:val="en_US" w:bidi="en_US"/>
+        </w:rPr>
+      </w:r>
+      <w:hyperlink r:id="rId22">
+        <w:r>
+          <w:rPr>
+            <w:lang w:val="en_US" w:bidi="en_US"/>
+          </w:rPr>
+          <w:rPr>
+            <w:color w:val="0000EE"/>
+            <w:u w:val="single"/>
+          </w:rPr>
+          <w:t>Filling the Gaps</w:t>
+        </w:r>
+      </w:hyperlink>
+      <w:r>
+        <w:rPr>
+          <w:lang w:val="en_US" w:bidi="en_US"/>
+        </w:rPr>
+        <w:t xml:space="preserve"> (1.8 MB)</w:t>
+      </w:r>
+      <w:r>
+        <w:rPr>
+          <w:lang w:val="en_US" w:bidi="en_US"/>
+        </w:rPr>
+      </w:r>
+      <w:r>
+        <w:rPr>
+          <w:lang w:val="en_US" w:bidi="en_US"/>
+        </w:rPr>
+      </w:r>
+      <w:r>
+        <w:rPr>
+          <w:lang w:val="en_US" w:bidi="en_US"/>
+        </w:rPr>
+      </w:r>
+    </w:p>
+    <w:p>
+      <w:pPr/>
+      <w:r>
+        <w:rPr>
+          <w:lang w:val="en_US" w:bidi="en_US"/>
+        </w:rPr>
+      </w:r>
+    </w:p>
+    <w:p>
+      <w:pPr>
+        <w:pStyle w:val="Heading2"/>
+      </w:pPr>
+      <w:r>
+        <w:rPr>
+          <w:lang w:val="en_US" w:bidi="en_US"/>
+        </w:rPr>
         <w:t>Job 1:13–22</w:t>
       </w:r>
       <w:r>
@@ -3964,6 +4424,236 @@
         <w:rPr>
           <w:lang w:val="en_US" w:bidi="en_US"/>
         </w:rPr>
+        <w:t>Job 1:13–22</w:t>
+      </w:r>
+      <w:r>
+        <w:rPr>
+          <w:lang w:val="en_US" w:bidi="en_US"/>
+        </w:rPr>
+      </w:r>
+    </w:p>
+    <w:p>
+      <w:pPr>
+        <w:pStyle w:val="Heading4"/>
+      </w:pPr>
+      <w:r>
+        <w:rPr>
+          <w:lang w:val="en_US" w:bidi="en_US"/>
+        </w:rPr>
+        <w:t>Audio Content</w:t>
+      </w:r>
+      <w:r>
+        <w:rPr>
+          <w:lang w:val="en_US" w:bidi="en_US"/>
+        </w:rPr>
+      </w:r>
+      <w:r>
+        <w:rPr>
+          <w:lang w:val="en_US" w:bidi="en_US"/>
+        </w:rPr>
+      </w:r>
+    </w:p>
+    <w:p>
+      <w:pPr>
+        <w:pStyle w:val="ListBullet"/>
+        <w:spacing w:line="240" w:lineRule="auto"/>
+        <w:ind w:left="720"/>
+      </w:pPr>
+      <w:r>
+        <w:rPr>
+          <w:lang w:val="en_US" w:bidi="en_US"/>
+        </w:rPr>
+      </w:r>
+      <w:hyperlink r:id="rId23">
+        <w:r>
+          <w:rPr>
+            <w:lang w:val="en_US" w:bidi="en_US"/>
+          </w:rPr>
+          <w:rPr>
+            <w:color w:val="0000EE"/>
+            <w:u w:val="single"/>
+          </w:rPr>
+          <w:t>Hear and Heart</w:t>
+        </w:r>
+      </w:hyperlink>
+      <w:r>
+        <w:rPr>
+          <w:lang w:val="en_US" w:bidi="en_US"/>
+        </w:rPr>
+        <w:t xml:space="preserve"> (306 KB)</w:t>
+      </w:r>
+      <w:r>
+        <w:rPr>
+          <w:lang w:val="en_US" w:bidi="en_US"/>
+        </w:rPr>
+      </w:r>
+    </w:p>
+    <w:p>
+      <w:pPr>
+        <w:pStyle w:val="ListBullet"/>
+        <w:spacing w:line="240" w:lineRule="auto"/>
+        <w:ind w:left="720"/>
+      </w:pPr>
+      <w:r>
+        <w:rPr>
+          <w:lang w:val="en_US" w:bidi="en_US"/>
+        </w:rPr>
+      </w:r>
+      <w:hyperlink r:id="rId24">
+        <w:r>
+          <w:rPr>
+            <w:lang w:val="en_US" w:bidi="en_US"/>
+          </w:rPr>
+          <w:rPr>
+            <w:color w:val="0000EE"/>
+            <w:u w:val="single"/>
+          </w:rPr>
+          <w:t>Setting the Stage</w:t>
+        </w:r>
+      </w:hyperlink>
+      <w:r>
+        <w:rPr>
+          <w:lang w:val="en_US" w:bidi="en_US"/>
+        </w:rPr>
+        <w:t xml:space="preserve"> (2.3 MB)</w:t>
+      </w:r>
+      <w:r>
+        <w:rPr>
+          <w:lang w:val="en_US" w:bidi="en_US"/>
+        </w:rPr>
+      </w:r>
+    </w:p>
+    <w:p>
+      <w:pPr>
+        <w:pStyle w:val="ListBullet"/>
+        <w:spacing w:line="240" w:lineRule="auto"/>
+        <w:ind w:left="720"/>
+      </w:pPr>
+      <w:r>
+        <w:rPr>
+          <w:lang w:val="en_US" w:bidi="en_US"/>
+        </w:rPr>
+      </w:r>
+      <w:hyperlink r:id="rId25">
+        <w:r>
+          <w:rPr>
+            <w:lang w:val="en_US" w:bidi="en_US"/>
+          </w:rPr>
+          <w:rPr>
+            <w:color w:val="0000EE"/>
+            <w:u w:val="single"/>
+          </w:rPr>
+          <w:t>Defining the Scenes</w:t>
+        </w:r>
+      </w:hyperlink>
+      <w:r>
+        <w:rPr>
+          <w:lang w:val="en_US" w:bidi="en_US"/>
+        </w:rPr>
+        <w:t xml:space="preserve"> (1.7 MB)</w:t>
+      </w:r>
+      <w:r>
+        <w:rPr>
+          <w:lang w:val="en_US" w:bidi="en_US"/>
+        </w:rPr>
+      </w:r>
+    </w:p>
+    <w:p>
+      <w:pPr>
+        <w:pStyle w:val="ListBullet"/>
+        <w:spacing w:line="240" w:lineRule="auto"/>
+        <w:ind w:left="720"/>
+      </w:pPr>
+      <w:r>
+        <w:rPr>
+          <w:lang w:val="en_US" w:bidi="en_US"/>
+        </w:rPr>
+      </w:r>
+      <w:hyperlink r:id="rId26">
+        <w:r>
+          <w:rPr>
+            <w:lang w:val="en_US" w:bidi="en_US"/>
+          </w:rPr>
+          <w:rPr>
+            <w:color w:val="0000EE"/>
+            <w:u w:val="single"/>
+          </w:rPr>
+          <w:t>Embodying the Text</w:t>
+        </w:r>
+      </w:hyperlink>
+      <w:r>
+        <w:rPr>
+          <w:lang w:val="en_US" w:bidi="en_US"/>
+        </w:rPr>
+        <w:t xml:space="preserve"> (1.2 MB)</w:t>
+      </w:r>
+      <w:r>
+        <w:rPr>
+          <w:lang w:val="en_US" w:bidi="en_US"/>
+        </w:rPr>
+      </w:r>
+    </w:p>
+    <w:p>
+      <w:pPr>
+        <w:pStyle w:val="ListBullet"/>
+        <w:spacing w:line="240" w:lineRule="auto"/>
+        <w:ind w:left="720"/>
+      </w:pPr>
+      <w:r>
+        <w:rPr>
+          <w:lang w:val="en_US" w:bidi="en_US"/>
+        </w:rPr>
+      </w:r>
+      <w:hyperlink r:id="rId27">
+        <w:r>
+          <w:rPr>
+            <w:lang w:val="en_US" w:bidi="en_US"/>
+          </w:rPr>
+          <w:rPr>
+            <w:color w:val="0000EE"/>
+            <w:u w:val="single"/>
+          </w:rPr>
+          <w:t>Filling the Gaps</w:t>
+        </w:r>
+      </w:hyperlink>
+      <w:r>
+        <w:rPr>
+          <w:lang w:val="en_US" w:bidi="en_US"/>
+        </w:rPr>
+        <w:t xml:space="preserve"> (1.1 MB)</w:t>
+      </w:r>
+      <w:r>
+        <w:rPr>
+          <w:lang w:val="en_US" w:bidi="en_US"/>
+        </w:rPr>
+      </w:r>
+      <w:r>
+        <w:rPr>
+          <w:lang w:val="en_US" w:bidi="en_US"/>
+        </w:rPr>
+      </w:r>
+      <w:r>
+        <w:rPr>
+          <w:lang w:val="en_US" w:bidi="en_US"/>
+        </w:rPr>
+      </w:r>
+    </w:p>
+    <w:p>
+      <w:pPr/>
+      <w:r>
+        <w:rPr>
+          <w:lang w:val="en_US" w:bidi="en_US"/>
+        </w:rPr>
+      </w:r>
+    </w:p>
+    <w:p>
+      <w:pPr>
+        <w:pStyle w:val="Heading2"/>
+      </w:pPr>
+      <w:r>
+        <w:rPr>
+          <w:lang w:val="en_US" w:bidi="en_US"/>
+        </w:rPr>
         <w:t>Job 2:1–6</w:t>
       </w:r>
       <w:r>
@@ -5207,6 +5897,236 @@
         <w:rPr>
           <w:lang w:val="en_US" w:bidi="en_US"/>
         </w:rPr>
+        <w:t>Job 2:1–6</w:t>
+      </w:r>
+      <w:r>
+        <w:rPr>
+          <w:lang w:val="en_US" w:bidi="en_US"/>
+        </w:rPr>
+      </w:r>
+    </w:p>
+    <w:p>
+      <w:pPr>
+        <w:pStyle w:val="Heading4"/>
+      </w:pPr>
+      <w:r>
+        <w:rPr>
+          <w:lang w:val="en_US" w:bidi="en_US"/>
+        </w:rPr>
+        <w:t>Audio Content</w:t>
+      </w:r>
+      <w:r>
+        <w:rPr>
+          <w:lang w:val="en_US" w:bidi="en_US"/>
+        </w:rPr>
+      </w:r>
+      <w:r>
+        <w:rPr>
+          <w:lang w:val="en_US" w:bidi="en_US"/>
+        </w:rPr>
+      </w:r>
+    </w:p>
+    <w:p>
+      <w:pPr>
+        <w:pStyle w:val="ListBullet"/>
+        <w:spacing w:line="240" w:lineRule="auto"/>
+        <w:ind w:left="720"/>
+      </w:pPr>
+      <w:r>
+        <w:rPr>
+          <w:lang w:val="en_US" w:bidi="en_US"/>
+        </w:rPr>
+      </w:r>
+      <w:hyperlink r:id="rId28">
+        <w:r>
+          <w:rPr>
+            <w:lang w:val="en_US" w:bidi="en_US"/>
+          </w:rPr>
+          <w:rPr>
+            <w:color w:val="0000EE"/>
+            <w:u w:val="single"/>
+          </w:rPr>
+          <w:t>Hear and Heart</w:t>
+        </w:r>
+      </w:hyperlink>
+      <w:r>
+        <w:rPr>
+          <w:lang w:val="en_US" w:bidi="en_US"/>
+        </w:rPr>
+        <w:t xml:space="preserve"> (305 KB)</w:t>
+      </w:r>
+      <w:r>
+        <w:rPr>
+          <w:lang w:val="en_US" w:bidi="en_US"/>
+        </w:rPr>
+      </w:r>
+    </w:p>
+    <w:p>
+      <w:pPr>
+        <w:pStyle w:val="ListBullet"/>
+        <w:spacing w:line="240" w:lineRule="auto"/>
+        <w:ind w:left="720"/>
+      </w:pPr>
+      <w:r>
+        <w:rPr>
+          <w:lang w:val="en_US" w:bidi="en_US"/>
+        </w:rPr>
+      </w:r>
+      <w:hyperlink r:id="rId29">
+        <w:r>
+          <w:rPr>
+            <w:lang w:val="en_US" w:bidi="en_US"/>
+          </w:rPr>
+          <w:rPr>
+            <w:color w:val="0000EE"/>
+            <w:u w:val="single"/>
+          </w:rPr>
+          <w:t>Setting the Stage</w:t>
+        </w:r>
+      </w:hyperlink>
+      <w:r>
+        <w:rPr>
+          <w:lang w:val="en_US" w:bidi="en_US"/>
+        </w:rPr>
+        <w:t xml:space="preserve"> (2.5 MB)</w:t>
+      </w:r>
+      <w:r>
+        <w:rPr>
+          <w:lang w:val="en_US" w:bidi="en_US"/>
+        </w:rPr>
+      </w:r>
+    </w:p>
+    <w:p>
+      <w:pPr>
+        <w:pStyle w:val="ListBullet"/>
+        <w:spacing w:line="240" w:lineRule="auto"/>
+        <w:ind w:left="720"/>
+      </w:pPr>
+      <w:r>
+        <w:rPr>
+          <w:lang w:val="en_US" w:bidi="en_US"/>
+        </w:rPr>
+      </w:r>
+      <w:hyperlink r:id="rId30">
+        <w:r>
+          <w:rPr>
+            <w:lang w:val="en_US" w:bidi="en_US"/>
+          </w:rPr>
+          <w:rPr>
+            <w:color w:val="0000EE"/>
+            <w:u w:val="single"/>
+          </w:rPr>
+          <w:t>Defining the Scenes</w:t>
+        </w:r>
+      </w:hyperlink>
+      <w:r>
+        <w:rPr>
+          <w:lang w:val="en_US" w:bidi="en_US"/>
+        </w:rPr>
+        <w:t xml:space="preserve"> (1.1 MB)</w:t>
+      </w:r>
+      <w:r>
+        <w:rPr>
+          <w:lang w:val="en_US" w:bidi="en_US"/>
+        </w:rPr>
+      </w:r>
+    </w:p>
+    <w:p>
+      <w:pPr>
+        <w:pStyle w:val="ListBullet"/>
+        <w:spacing w:line="240" w:lineRule="auto"/>
+        <w:ind w:left="720"/>
+      </w:pPr>
+      <w:r>
+        <w:rPr>
+          <w:lang w:val="en_US" w:bidi="en_US"/>
+        </w:rPr>
+      </w:r>
+      <w:hyperlink r:id="rId31">
+        <w:r>
+          <w:rPr>
+            <w:lang w:val="en_US" w:bidi="en_US"/>
+          </w:rPr>
+          <w:rPr>
+            <w:color w:val="0000EE"/>
+            <w:u w:val="single"/>
+          </w:rPr>
+          <w:t>Embodying the Text</w:t>
+        </w:r>
+      </w:hyperlink>
+      <w:r>
+        <w:rPr>
+          <w:lang w:val="en_US" w:bidi="en_US"/>
+        </w:rPr>
+        <w:t xml:space="preserve"> (1013 KB)</w:t>
+      </w:r>
+      <w:r>
+        <w:rPr>
+          <w:lang w:val="en_US" w:bidi="en_US"/>
+        </w:rPr>
+      </w:r>
+    </w:p>
+    <w:p>
+      <w:pPr>
+        <w:pStyle w:val="ListBullet"/>
+        <w:spacing w:line="240" w:lineRule="auto"/>
+        <w:ind w:left="720"/>
+      </w:pPr>
+      <w:r>
+        <w:rPr>
+          <w:lang w:val="en_US" w:bidi="en_US"/>
+        </w:rPr>
+      </w:r>
+      <w:hyperlink r:id="rId32">
+        <w:r>
+          <w:rPr>
+            <w:lang w:val="en_US" w:bidi="en_US"/>
+          </w:rPr>
+          <w:rPr>
+            <w:color w:val="0000EE"/>
+            <w:u w:val="single"/>
+          </w:rPr>
+          <w:t>Filling the Gaps</w:t>
+        </w:r>
+      </w:hyperlink>
+      <w:r>
+        <w:rPr>
+          <w:lang w:val="en_US" w:bidi="en_US"/>
+        </w:rPr>
+        <w:t xml:space="preserve"> (1.4 MB)</w:t>
+      </w:r>
+      <w:r>
+        <w:rPr>
+          <w:lang w:val="en_US" w:bidi="en_US"/>
+        </w:rPr>
+      </w:r>
+      <w:r>
+        <w:rPr>
+          <w:lang w:val="en_US" w:bidi="en_US"/>
+        </w:rPr>
+      </w:r>
+      <w:r>
+        <w:rPr>
+          <w:lang w:val="en_US" w:bidi="en_US"/>
+        </w:rPr>
+      </w:r>
+    </w:p>
+    <w:p>
+      <w:pPr/>
+      <w:r>
+        <w:rPr>
+          <w:lang w:val="en_US" w:bidi="en_US"/>
+        </w:rPr>
+      </w:r>
+    </w:p>
+    <w:p>
+      <w:pPr>
+        <w:pStyle w:val="Heading2"/>
+      </w:pPr>
+      <w:r>
+        <w:rPr>
+          <w:lang w:val="en_US" w:bidi="en_US"/>
+        </w:rPr>
         <w:t>Job 2:7–13</w:t>
       </w:r>
       <w:r>
@@ -6548,6 +7468,236 @@
           <w:lang w:val="en_US" w:bidi="en_US"/>
         </w:rPr>
         <w:t xml:space="preserve"> Job. Sympathize and comfort are actions that a person does to another person that is mourning or suffering. Job's friends did this in several ways. First, they raised their voices and wept, which means they cried loudly. Then, they tore their robes or their clothes. Then, they sprinkled dust toward heaven so it would land on their heads. This is a way to show that they want to share in Job's suffering so that Job's suffering would somehow be lessened. Then, they sat silently with Job among the ashes for seven days.</w:t>
+      </w:r>
+      <w:r>
+        <w:rPr>
+          <w:lang w:val="en_US" w:bidi="en_US"/>
+        </w:rPr>
+      </w:r>
+      <w:r>
+        <w:rPr>
+          <w:lang w:val="en_US" w:bidi="en_US"/>
+        </w:rPr>
+      </w:r>
+    </w:p>
+    <w:p>
+      <w:pPr/>
+      <w:r>
+        <w:rPr>
+          <w:lang w:val="en_US" w:bidi="en_US"/>
+        </w:rPr>
+      </w:r>
+    </w:p>
+    <w:p>
+      <w:pPr>
+        <w:pStyle w:val="Heading2"/>
+      </w:pPr>
+      <w:r>
+        <w:rPr>
+          <w:lang w:val="en_US" w:bidi="en_US"/>
+        </w:rPr>
+        <w:t>Job 2:7–13</w:t>
+      </w:r>
+      <w:r>
+        <w:rPr>
+          <w:lang w:val="en_US" w:bidi="en_US"/>
+        </w:rPr>
+      </w:r>
+    </w:p>
+    <w:p>
+      <w:pPr>
+        <w:pStyle w:val="Heading4"/>
+      </w:pPr>
+      <w:r>
+        <w:rPr>
+          <w:lang w:val="en_US" w:bidi="en_US"/>
+        </w:rPr>
+        <w:t>Audio Content</w:t>
+      </w:r>
+      <w:r>
+        <w:rPr>
+          <w:lang w:val="en_US" w:bidi="en_US"/>
+        </w:rPr>
+      </w:r>
+      <w:r>
+        <w:rPr>
+          <w:lang w:val="en_US" w:bidi="en_US"/>
+        </w:rPr>
+      </w:r>
+    </w:p>
+    <w:p>
+      <w:pPr>
+        <w:pStyle w:val="ListBullet"/>
+        <w:spacing w:line="240" w:lineRule="auto"/>
+        <w:ind w:left="720"/>
+      </w:pPr>
+      <w:r>
+        <w:rPr>
+          <w:lang w:val="en_US" w:bidi="en_US"/>
+        </w:rPr>
+      </w:r>
+      <w:hyperlink r:id="rId33">
+        <w:r>
+          <w:rPr>
+            <w:lang w:val="en_US" w:bidi="en_US"/>
+          </w:rPr>
+          <w:rPr>
+            <w:color w:val="0000EE"/>
+            <w:u w:val="single"/>
+          </w:rPr>
+          <w:t>Hear and Heart</w:t>
+        </w:r>
+      </w:hyperlink>
+      <w:r>
+        <w:rPr>
+          <w:lang w:val="en_US" w:bidi="en_US"/>
+        </w:rPr>
+        <w:t xml:space="preserve"> (307 KB)</w:t>
+      </w:r>
+      <w:r>
+        <w:rPr>
+          <w:lang w:val="en_US" w:bidi="en_US"/>
+        </w:rPr>
+      </w:r>
+    </w:p>
+    <w:p>
+      <w:pPr>
+        <w:pStyle w:val="ListBullet"/>
+        <w:spacing w:line="240" w:lineRule="auto"/>
+        <w:ind w:left="720"/>
+      </w:pPr>
+      <w:r>
+        <w:rPr>
+          <w:lang w:val="en_US" w:bidi="en_US"/>
+        </w:rPr>
+      </w:r>
+      <w:hyperlink r:id="rId34">
+        <w:r>
+          <w:rPr>
+            <w:lang w:val="en_US" w:bidi="en_US"/>
+          </w:rPr>
+          <w:rPr>
+            <w:color w:val="0000EE"/>
+            <w:u w:val="single"/>
+          </w:rPr>
+          <w:t>Setting the Stage</w:t>
+        </w:r>
+      </w:hyperlink>
+      <w:r>
+        <w:rPr>
+          <w:lang w:val="en_US" w:bidi="en_US"/>
+        </w:rPr>
+        <w:t xml:space="preserve"> (2.2 MB)</w:t>
+      </w:r>
+      <w:r>
+        <w:rPr>
+          <w:lang w:val="en_US" w:bidi="en_US"/>
+        </w:rPr>
+      </w:r>
+    </w:p>
+    <w:p>
+      <w:pPr>
+        <w:pStyle w:val="ListBullet"/>
+        <w:spacing w:line="240" w:lineRule="auto"/>
+        <w:ind w:left="720"/>
+      </w:pPr>
+      <w:r>
+        <w:rPr>
+          <w:lang w:val="en_US" w:bidi="en_US"/>
+        </w:rPr>
+      </w:r>
+      <w:hyperlink r:id="rId35">
+        <w:r>
+          <w:rPr>
+            <w:lang w:val="en_US" w:bidi="en_US"/>
+          </w:rPr>
+          <w:rPr>
+            <w:color w:val="0000EE"/>
+            <w:u w:val="single"/>
+          </w:rPr>
+          <w:t>Defining the Scenes</w:t>
+        </w:r>
+      </w:hyperlink>
+      <w:r>
+        <w:rPr>
+          <w:lang w:val="en_US" w:bidi="en_US"/>
+        </w:rPr>
+        <w:t xml:space="preserve"> (1.6 MB)</w:t>
+      </w:r>
+      <w:r>
+        <w:rPr>
+          <w:lang w:val="en_US" w:bidi="en_US"/>
+        </w:rPr>
+      </w:r>
+    </w:p>
+    <w:p>
+      <w:pPr>
+        <w:pStyle w:val="ListBullet"/>
+        <w:spacing w:line="240" w:lineRule="auto"/>
+        <w:ind w:left="720"/>
+      </w:pPr>
+      <w:r>
+        <w:rPr>
+          <w:lang w:val="en_US" w:bidi="en_US"/>
+        </w:rPr>
+      </w:r>
+      <w:hyperlink r:id="rId36">
+        <w:r>
+          <w:rPr>
+            <w:lang w:val="en_US" w:bidi="en_US"/>
+          </w:rPr>
+          <w:rPr>
+            <w:color w:val="0000EE"/>
+            <w:u w:val="single"/>
+          </w:rPr>
+          <w:t>Embodying the Text</w:t>
+        </w:r>
+      </w:hyperlink>
+      <w:r>
+        <w:rPr>
+          <w:lang w:val="en_US" w:bidi="en_US"/>
+        </w:rPr>
+        <w:t xml:space="preserve"> (1.4 MB)</w:t>
+      </w:r>
+      <w:r>
+        <w:rPr>
+          <w:lang w:val="en_US" w:bidi="en_US"/>
+        </w:rPr>
+      </w:r>
+    </w:p>
+    <w:p>
+      <w:pPr>
+        <w:pStyle w:val="ListBullet"/>
+        <w:spacing w:line="240" w:lineRule="auto"/>
+        <w:ind w:left="720"/>
+      </w:pPr>
+      <w:r>
+        <w:rPr>
+          <w:lang w:val="en_US" w:bidi="en_US"/>
+        </w:rPr>
+      </w:r>
+      <w:hyperlink r:id="rId37">
+        <w:r>
+          <w:rPr>
+            <w:lang w:val="en_US" w:bidi="en_US"/>
+          </w:rPr>
+          <w:rPr>
+            <w:color w:val="0000EE"/>
+            <w:u w:val="single"/>
+          </w:rPr>
+          <w:t>Filling the Gaps</w:t>
+        </w:r>
+      </w:hyperlink>
+      <w:r>
+        <w:rPr>
+          <w:lang w:val="en_US" w:bidi="en_US"/>
+        </w:rPr>
+        <w:t xml:space="preserve"> (1.5 MB)</w:t>
+      </w:r>
+      <w:r>
+        <w:rPr>
+          <w:lang w:val="en_US" w:bidi="en_US"/>
+        </w:rPr>
       </w:r>
       <w:r>
         <w:rPr>

</xml_diff>

<commit_message>
Refresh Bible resource data for 2026-10-28 release
</commit_message>
<xml_diff>
--- a/eng/docx/18.content.docx
+++ b/eng/docx/18.content.docx
@@ -1247,12 +1247,18 @@
         </w:rPr>
         <w:t xml:space="preserve">. The fear of God is an Old Testament expression that refers to the act of living with constant awareness of God's control over the world and over a person's life. For more information about fear or </w:t>
       </w:r>
-      <w:r>
-        <w:rPr>
-          <w:lang w:val="en_US" w:bidi="en_US"/>
-        </w:rPr>
-        <w:t>fear of God</w:t>
-      </w:r>
+      <w:hyperlink r:id="rId13">
+        <w:r>
+          <w:rPr>
+            <w:lang w:val="en_US" w:bidi="en_US"/>
+          </w:rPr>
+          <w:rPr>
+            <w:color w:val="0000EE"/>
+            <w:u w:val="single"/>
+          </w:rPr>
+          <w:t>fear of God</w:t>
+        </w:r>
+      </w:hyperlink>
       <w:r>
         <w:rPr>
           <w:lang w:val="en_US" w:bidi="en_US"/>
@@ -1340,12 +1346,18 @@
         </w:rPr>
         <w:t xml:space="preserve"> to God for each of his sons. Burnt offering is a ritual that involves the killing and the burning of an animal sacrifice. It is offered for various reasons, such as when a person wants to thank God or ask God for something. Another reason is to ask God for forgiveness of sins. In the story, this was Job's reason for the burnt offerings. For more information about </w:t>
       </w:r>
-      <w:r>
-        <w:rPr>
-          <w:lang w:val="en_US" w:bidi="en_US"/>
-        </w:rPr>
-        <w:t>burnt offering</w:t>
-      </w:r>
+      <w:hyperlink r:id="rId14">
+        <w:r>
+          <w:rPr>
+            <w:lang w:val="en_US" w:bidi="en_US"/>
+          </w:rPr>
+          <w:rPr>
+            <w:color w:val="0000EE"/>
+            <w:u w:val="single"/>
+          </w:rPr>
+          <w:t>burnt offering</w:t>
+        </w:r>
+      </w:hyperlink>
       <w:r>
         <w:rPr>
           <w:lang w:val="en_US" w:bidi="en_US"/>
@@ -1378,24 +1390,36 @@
         </w:rPr>
         <w:t xml:space="preserve">. Sin means disobedience to God. Cursing is when a person wishes for something unpleasant to happen to another person. Cursing God in the heart is when a person has evil thoughts against God. You may refer to the Master Glossary for more information about </w:t>
       </w:r>
-      <w:r>
-        <w:rPr>
-          <w:lang w:val="en_US" w:bidi="en_US"/>
-        </w:rPr>
-        <w:t>sin</w:t>
-      </w:r>
+      <w:hyperlink r:id="rId15">
+        <w:r>
+          <w:rPr>
+            <w:lang w:val="en_US" w:bidi="en_US"/>
+          </w:rPr>
+          <w:rPr>
+            <w:color w:val="0000EE"/>
+            <w:u w:val="single"/>
+          </w:rPr>
+          <w:t>sin</w:t>
+        </w:r>
+      </w:hyperlink>
       <w:r>
         <w:rPr>
           <w:lang w:val="en_US" w:bidi="en_US"/>
         </w:rPr>
         <w:t xml:space="preserve"> and </w:t>
       </w:r>
-      <w:r>
-        <w:rPr>
-          <w:lang w:val="en_US" w:bidi="en_US"/>
-        </w:rPr>
-        <w:t>curse</w:t>
-      </w:r>
+      <w:hyperlink r:id="rId16">
+        <w:r>
+          <w:rPr>
+            <w:lang w:val="en_US" w:bidi="en_US"/>
+          </w:rPr>
+          <w:rPr>
+            <w:color w:val="0000EE"/>
+            <w:u w:val="single"/>
+          </w:rPr>
+          <w:t>curse</w:t>
+        </w:r>
+      </w:hyperlink>
       <w:r>
         <w:rPr>
           <w:lang w:val="en_US" w:bidi="en_US"/>
@@ -1469,7 +1493,7 @@
           <w:lang w:val="en_US" w:bidi="en_US"/>
         </w:rPr>
       </w:r>
-      <w:hyperlink r:id="rId13">
+      <w:hyperlink r:id="rId17">
         <w:r>
           <w:rPr>
             <w:lang w:val="en_US" w:bidi="en_US"/>
@@ -1504,7 +1528,7 @@
           <w:lang w:val="en_US" w:bidi="en_US"/>
         </w:rPr>
       </w:r>
-      <w:hyperlink r:id="rId14">
+      <w:hyperlink r:id="rId18">
         <w:r>
           <w:rPr>
             <w:lang w:val="en_US" w:bidi="en_US"/>
@@ -1539,7 +1563,7 @@
           <w:lang w:val="en_US" w:bidi="en_US"/>
         </w:rPr>
       </w:r>
-      <w:hyperlink r:id="rId15">
+      <w:hyperlink r:id="rId19">
         <w:r>
           <w:rPr>
             <w:lang w:val="en_US" w:bidi="en_US"/>
@@ -1574,7 +1598,7 @@
           <w:lang w:val="en_US" w:bidi="en_US"/>
         </w:rPr>
       </w:r>
-      <w:hyperlink r:id="rId16">
+      <w:hyperlink r:id="rId20">
         <w:r>
           <w:rPr>
             <w:lang w:val="en_US" w:bidi="en_US"/>
@@ -1609,7 +1633,7 @@
           <w:lang w:val="en_US" w:bidi="en_US"/>
         </w:rPr>
       </w:r>
-      <w:hyperlink r:id="rId17">
+      <w:hyperlink r:id="rId21">
         <w:r>
           <w:rPr>
             <w:lang w:val="en_US" w:bidi="en_US"/>
@@ -2584,14 +2608,38 @@
         <w:rPr>
           <w:lang w:val="en_US" w:bidi="en_US"/>
         </w:rPr>
-        <w:t xml:space="preserve">, that were servants of God. As God had human servants, God had spirit servants as well. This shows that God is king in both heaven and on earth. It shows his power and control over everything that happens in the world. God's spirit servants were called sons of God. As servants, God gave them work to do and they were required to present themselves before God, or to report the progress of their work to God. You may refer to the Master Glossary for more information about sons of God or </w:t>
-      </w:r>
-      <w:r>
-        <w:rPr>
-          <w:lang w:val="en_US" w:bidi="en_US"/>
-        </w:rPr>
-        <w:t>angels</w:t>
-      </w:r>
+        <w:t xml:space="preserve">, that were servants of God. As God had human servants, God had spirit servants as well. This shows that God is king in both heaven and on earth. It shows his power and control over everything that happens in the world. God's spirit servants were called sons of God. As servants, God gave them work to do and they were required to present themselves before God, or to report the progress of their work to God. You may refer to the Master Glossary for more information about </w:t>
+      </w:r>
+      <w:hyperlink r:id="rId22">
+        <w:r>
+          <w:rPr>
+            <w:lang w:val="en_US" w:bidi="en_US"/>
+          </w:rPr>
+          <w:rPr>
+            <w:color w:val="0000EE"/>
+            <w:u w:val="single"/>
+          </w:rPr>
+          <w:t>sons of God</w:t>
+        </w:r>
+      </w:hyperlink>
+      <w:r>
+        <w:rPr>
+          <w:lang w:val="en_US" w:bidi="en_US"/>
+        </w:rPr>
+        <w:t xml:space="preserve"> or </w:t>
+      </w:r>
+      <w:hyperlink r:id="rId23">
+        <w:r>
+          <w:rPr>
+            <w:lang w:val="en_US" w:bidi="en_US"/>
+          </w:rPr>
+          <w:rPr>
+            <w:color w:val="0000EE"/>
+            <w:u w:val="single"/>
+          </w:rPr>
+          <w:t>angels</w:t>
+        </w:r>
+      </w:hyperlink>
       <w:r>
         <w:rPr>
           <w:lang w:val="en_US" w:bidi="en_US"/>
@@ -2624,12 +2672,18 @@
         </w:rPr>
         <w:t xml:space="preserve">, the personal name for God, except for the word "sons of God" and except when God and Satan will mention the word, "God." Your team should translate the personal name of God, Yahweh, in the same way you have in other stories and remember that </w:t>
       </w:r>
-      <w:r>
-        <w:rPr>
-          <w:lang w:val="en_US" w:bidi="en_US"/>
-        </w:rPr>
-        <w:t>Yahweh</w:t>
-      </w:r>
+      <w:hyperlink r:id="rId24">
+        <w:r>
+          <w:rPr>
+            <w:lang w:val="en_US" w:bidi="en_US"/>
+          </w:rPr>
+          <w:rPr>
+            <w:color w:val="0000EE"/>
+            <w:u w:val="single"/>
+          </w:rPr>
+          <w:t>Yahweh</w:t>
+        </w:r>
+      </w:hyperlink>
       <w:r>
         <w:rPr>
           <w:lang w:val="en_US" w:bidi="en_US"/>
@@ -2657,12 +2711,18 @@
         </w:rPr>
         <w:t xml:space="preserve"> also came to present himself. In the Hebrew, "Satan" means enemy or accuser. It is not a person's name. Rather, it is a title that is associated with the work that God assigned him. His main job is to challenge or test people to see if they really love and obey God. You may call this character either as "Satan the accuser" or just "the accuser." For more information about </w:t>
       </w:r>
-      <w:r>
-        <w:rPr>
-          <w:lang w:val="en_US" w:bidi="en_US"/>
-        </w:rPr>
-        <w:t>Satan</w:t>
-      </w:r>
+      <w:hyperlink r:id="rId25">
+        <w:r>
+          <w:rPr>
+            <w:lang w:val="en_US" w:bidi="en_US"/>
+          </w:rPr>
+          <w:rPr>
+            <w:color w:val="0000EE"/>
+            <w:u w:val="single"/>
+          </w:rPr>
+          <w:t>Satan</w:t>
+        </w:r>
+      </w:hyperlink>
       <w:r>
         <w:rPr>
           <w:lang w:val="en_US" w:bidi="en_US"/>
@@ -2735,12 +2795,18 @@
         </w:rPr>
         <w:t xml:space="preserve">. The fear of God is an Old Testament expression that refers to the act of living with constant awareness of God's control over the world and over a person's life. For more information about fear or </w:t>
       </w:r>
-      <w:r>
-        <w:rPr>
-          <w:lang w:val="en_US" w:bidi="en_US"/>
-        </w:rPr>
-        <w:t>fear of God</w:t>
-      </w:r>
+      <w:hyperlink r:id="rId13">
+        <w:r>
+          <w:rPr>
+            <w:lang w:val="en_US" w:bidi="en_US"/>
+          </w:rPr>
+          <w:rPr>
+            <w:color w:val="0000EE"/>
+            <w:u w:val="single"/>
+          </w:rPr>
+          <w:t>fear of God</w:t>
+        </w:r>
+      </w:hyperlink>
       <w:r>
         <w:rPr>
           <w:lang w:val="en_US" w:bidi="en_US"/>
@@ -2774,12 +2840,18 @@
         </w:rPr>
         <w:t xml:space="preserve">. Cursing is when a person wishes for something unpleasant to happen to another person. Cursing God to his face is when a person speaks words or has thoughts that are against God. You may refer to the Master Glossary for more information about the word </w:t>
       </w:r>
-      <w:r>
-        <w:rPr>
-          <w:lang w:val="en_US" w:bidi="en_US"/>
-        </w:rPr>
-        <w:t>curse</w:t>
-      </w:r>
+      <w:hyperlink r:id="rId16">
+        <w:r>
+          <w:rPr>
+            <w:lang w:val="en_US" w:bidi="en_US"/>
+          </w:rPr>
+          <w:rPr>
+            <w:color w:val="0000EE"/>
+            <w:u w:val="single"/>
+          </w:rPr>
+          <w:t>curse</w:t>
+        </w:r>
+      </w:hyperlink>
       <w:r>
         <w:rPr>
           <w:lang w:val="en_US" w:bidi="en_US"/>
@@ -2880,7 +2952,7 @@
           <w:lang w:val="en_US" w:bidi="en_US"/>
         </w:rPr>
       </w:r>
-      <w:hyperlink r:id="rId18">
+      <w:hyperlink r:id="rId26">
         <w:r>
           <w:rPr>
             <w:lang w:val="en_US" w:bidi="en_US"/>
@@ -2915,7 +2987,7 @@
           <w:lang w:val="en_US" w:bidi="en_US"/>
         </w:rPr>
       </w:r>
-      <w:hyperlink r:id="rId19">
+      <w:hyperlink r:id="rId27">
         <w:r>
           <w:rPr>
             <w:lang w:val="en_US" w:bidi="en_US"/>
@@ -2950,7 +3022,7 @@
           <w:lang w:val="en_US" w:bidi="en_US"/>
         </w:rPr>
       </w:r>
-      <w:hyperlink r:id="rId20">
+      <w:hyperlink r:id="rId28">
         <w:r>
           <w:rPr>
             <w:lang w:val="en_US" w:bidi="en_US"/>
@@ -2985,7 +3057,7 @@
           <w:lang w:val="en_US" w:bidi="en_US"/>
         </w:rPr>
       </w:r>
-      <w:hyperlink r:id="rId21">
+      <w:hyperlink r:id="rId29">
         <w:r>
           <w:rPr>
             <w:lang w:val="en_US" w:bidi="en_US"/>
@@ -3020,7 +3092,7 @@
           <w:lang w:val="en_US" w:bidi="en_US"/>
         </w:rPr>
       </w:r>
-      <w:hyperlink r:id="rId22">
+      <w:hyperlink r:id="rId30">
         <w:r>
           <w:rPr>
             <w:lang w:val="en_US" w:bidi="en_US"/>
@@ -4297,12 +4369,18 @@
         </w:rPr>
         <w:t xml:space="preserve"> God. Worship to God refers to the act of bowing to the ground and praising God for his greatness. You may refer to the Master Glossary for more information about the word, </w:t>
       </w:r>
-      <w:r>
-        <w:rPr>
-          <w:lang w:val="en_US" w:bidi="en_US"/>
-        </w:rPr>
-        <w:t>worship</w:t>
-      </w:r>
+      <w:hyperlink r:id="rId31">
+        <w:r>
+          <w:rPr>
+            <w:lang w:val="en_US" w:bidi="en_US"/>
+          </w:rPr>
+          <w:rPr>
+            <w:color w:val="0000EE"/>
+            <w:u w:val="single"/>
+          </w:rPr>
+          <w:t>worship</w:t>
+        </w:r>
+      </w:hyperlink>
       <w:r>
         <w:rPr>
           <w:lang w:val="en_US" w:bidi="en_US"/>
@@ -4322,36 +4400,54 @@
         </w:rPr>
         <w:t xml:space="preserve"> the name of Lord. Remember that the word </w:t>
       </w:r>
-      <w:r>
-        <w:rPr>
-          <w:lang w:val="en_US" w:bidi="en_US"/>
-        </w:rPr>
-        <w:t>bless</w:t>
-      </w:r>
+      <w:hyperlink r:id="rId32">
+        <w:r>
+          <w:rPr>
+            <w:lang w:val="en_US" w:bidi="en_US"/>
+          </w:rPr>
+          <w:rPr>
+            <w:color w:val="0000EE"/>
+            <w:u w:val="single"/>
+          </w:rPr>
+          <w:t>bless</w:t>
+        </w:r>
+      </w:hyperlink>
       <w:r>
         <w:rPr>
           <w:lang w:val="en_US" w:bidi="en_US"/>
         </w:rPr>
         <w:t xml:space="preserve"> here is also in the Master Glossary. The word Lord here refers to Yahweh, God's personal name. You may refer to the Master Glossary for more information about the words for </w:t>
       </w:r>
-      <w:r>
-        <w:rPr>
-          <w:lang w:val="en_US" w:bidi="en_US"/>
-        </w:rPr>
-        <w:t>God</w:t>
-      </w:r>
+      <w:hyperlink r:id="rId33">
+        <w:r>
+          <w:rPr>
+            <w:lang w:val="en_US" w:bidi="en_US"/>
+          </w:rPr>
+          <w:rPr>
+            <w:color w:val="0000EE"/>
+            <w:u w:val="single"/>
+          </w:rPr>
+          <w:t>God</w:t>
+        </w:r>
+      </w:hyperlink>
       <w:r>
         <w:rPr>
           <w:lang w:val="en_US" w:bidi="en_US"/>
         </w:rPr>
         <w:t xml:space="preserve"> and </w:t>
       </w:r>
-      <w:r>
-        <w:rPr>
-          <w:lang w:val="en_US" w:bidi="en_US"/>
-        </w:rPr>
-        <w:t>Yahweh</w:t>
-      </w:r>
+      <w:hyperlink r:id="rId24">
+        <w:r>
+          <w:rPr>
+            <w:lang w:val="en_US" w:bidi="en_US"/>
+          </w:rPr>
+          <w:rPr>
+            <w:color w:val="0000EE"/>
+            <w:u w:val="single"/>
+          </w:rPr>
+          <w:t>Yahweh</w:t>
+        </w:r>
+      </w:hyperlink>
       <w:r>
         <w:rPr>
           <w:lang w:val="en_US" w:bidi="en_US"/>
@@ -4385,12 +4481,18 @@
         </w:rPr>
         <w:t xml:space="preserve">, or disobey God. Job also did not speak any evil word against God or blame him for all the things he lost. You may refer to the Master Glossary for more information about </w:t>
       </w:r>
-      <w:r>
-        <w:rPr>
-          <w:lang w:val="en_US" w:bidi="en_US"/>
-        </w:rPr>
-        <w:t>sin</w:t>
-      </w:r>
+      <w:hyperlink r:id="rId15">
+        <w:r>
+          <w:rPr>
+            <w:lang w:val="en_US" w:bidi="en_US"/>
+          </w:rPr>
+          <w:rPr>
+            <w:color w:val="0000EE"/>
+            <w:u w:val="single"/>
+          </w:rPr>
+          <w:t>sin</w:t>
+        </w:r>
+      </w:hyperlink>
       <w:r>
         <w:rPr>
           <w:lang w:val="en_US" w:bidi="en_US"/>
@@ -4464,7 +4566,7 @@
           <w:lang w:val="en_US" w:bidi="en_US"/>
         </w:rPr>
       </w:r>
-      <w:hyperlink r:id="rId23">
+      <w:hyperlink r:id="rId34">
         <w:r>
           <w:rPr>
             <w:lang w:val="en_US" w:bidi="en_US"/>
@@ -4499,7 +4601,7 @@
           <w:lang w:val="en_US" w:bidi="en_US"/>
         </w:rPr>
       </w:r>
-      <w:hyperlink r:id="rId24">
+      <w:hyperlink r:id="rId35">
         <w:r>
           <w:rPr>
             <w:lang w:val="en_US" w:bidi="en_US"/>
@@ -4534,7 +4636,7 @@
           <w:lang w:val="en_US" w:bidi="en_US"/>
         </w:rPr>
       </w:r>
-      <w:hyperlink r:id="rId25">
+      <w:hyperlink r:id="rId36">
         <w:r>
           <w:rPr>
             <w:lang w:val="en_US" w:bidi="en_US"/>
@@ -4569,7 +4671,7 @@
           <w:lang w:val="en_US" w:bidi="en_US"/>
         </w:rPr>
       </w:r>
-      <w:hyperlink r:id="rId26">
+      <w:hyperlink r:id="rId37">
         <w:r>
           <w:rPr>
             <w:lang w:val="en_US" w:bidi="en_US"/>
@@ -4604,7 +4706,7 @@
           <w:lang w:val="en_US" w:bidi="en_US"/>
         </w:rPr>
       </w:r>
-      <w:hyperlink r:id="rId27">
+      <w:hyperlink r:id="rId38">
         <w:r>
           <w:rPr>
             <w:lang w:val="en_US" w:bidi="en_US"/>
@@ -5666,12 +5768,18 @@
         </w:rPr>
         <w:t xml:space="preserve">, God's personal name except for the word "Son of God" and except for when God refers to himself. Your team should translate the personal name of God, Yahweh, in the same way you have in other stories and remember that </w:t>
       </w:r>
-      <w:r>
-        <w:rPr>
-          <w:lang w:val="en_US" w:bidi="en_US"/>
-        </w:rPr>
-        <w:t>Yahweh</w:t>
-      </w:r>
+      <w:hyperlink r:id="rId24">
+        <w:r>
+          <w:rPr>
+            <w:lang w:val="en_US" w:bidi="en_US"/>
+          </w:rPr>
+          <w:rPr>
+            <w:color w:val="0000EE"/>
+            <w:u w:val="single"/>
+          </w:rPr>
+          <w:t>Yahweh</w:t>
+        </w:r>
+      </w:hyperlink>
       <w:r>
         <w:rPr>
           <w:lang w:val="en_US" w:bidi="en_US"/>
@@ -5699,12 +5807,18 @@
         </w:rPr>
         <w:t xml:space="preserve"> also came to present himself. In the Hebrew, Satan means enemy or accuser. Remember to translate it the way you have translated it in the previous passage. For more information about </w:t>
       </w:r>
-      <w:r>
-        <w:rPr>
-          <w:lang w:val="en_US" w:bidi="en_US"/>
-        </w:rPr>
-        <w:t>Satan</w:t>
-      </w:r>
+      <w:hyperlink r:id="rId25">
+        <w:r>
+          <w:rPr>
+            <w:lang w:val="en_US" w:bidi="en_US"/>
+          </w:rPr>
+          <w:rPr>
+            <w:color w:val="0000EE"/>
+            <w:u w:val="single"/>
+          </w:rPr>
+          <w:t>Satan</w:t>
+        </w:r>
+      </w:hyperlink>
       <w:r>
         <w:rPr>
           <w:lang w:val="en_US" w:bidi="en_US"/>
@@ -5831,12 +5945,18 @@
         </w:rPr>
         <w:t xml:space="preserve">." Satan was telling God to inflict harm on Job's body so that Job would curse God. Cursing is when a person wishes for something unpleasant to happen to another person. Cursing God to his face is when a person speaks words or has thoughts that are against God. You may refer to the Master Glossary for more information about </w:t>
       </w:r>
-      <w:r>
-        <w:rPr>
-          <w:lang w:val="en_US" w:bidi="en_US"/>
-        </w:rPr>
-        <w:t>curse</w:t>
-      </w:r>
+      <w:hyperlink r:id="rId16">
+        <w:r>
+          <w:rPr>
+            <w:lang w:val="en_US" w:bidi="en_US"/>
+          </w:rPr>
+          <w:rPr>
+            <w:color w:val="0000EE"/>
+            <w:u w:val="single"/>
+          </w:rPr>
+          <w:t>curse</w:t>
+        </w:r>
+      </w:hyperlink>
       <w:r>
         <w:rPr>
           <w:lang w:val="en_US" w:bidi="en_US"/>
@@ -5937,7 +6057,7 @@
           <w:lang w:val="en_US" w:bidi="en_US"/>
         </w:rPr>
       </w:r>
-      <w:hyperlink r:id="rId28">
+      <w:hyperlink r:id="rId39">
         <w:r>
           <w:rPr>
             <w:lang w:val="en_US" w:bidi="en_US"/>
@@ -5972,7 +6092,7 @@
           <w:lang w:val="en_US" w:bidi="en_US"/>
         </w:rPr>
       </w:r>
-      <w:hyperlink r:id="rId29">
+      <w:hyperlink r:id="rId40">
         <w:r>
           <w:rPr>
             <w:lang w:val="en_US" w:bidi="en_US"/>
@@ -6007,7 +6127,7 @@
           <w:lang w:val="en_US" w:bidi="en_US"/>
         </w:rPr>
       </w:r>
-      <w:hyperlink r:id="rId30">
+      <w:hyperlink r:id="rId41">
         <w:r>
           <w:rPr>
             <w:lang w:val="en_US" w:bidi="en_US"/>
@@ -6042,7 +6162,7 @@
           <w:lang w:val="en_US" w:bidi="en_US"/>
         </w:rPr>
       </w:r>
-      <w:hyperlink r:id="rId31">
+      <w:hyperlink r:id="rId42">
         <w:r>
           <w:rPr>
             <w:lang w:val="en_US" w:bidi="en_US"/>
@@ -6077,7 +6197,7 @@
           <w:lang w:val="en_US" w:bidi="en_US"/>
         </w:rPr>
       </w:r>
-      <w:hyperlink r:id="rId32">
+      <w:hyperlink r:id="rId43">
         <w:r>
           <w:rPr>
             <w:lang w:val="en_US" w:bidi="en_US"/>
@@ -7338,12 +7458,18 @@
         </w:rPr>
         <w:t xml:space="preserve"> so that God will kill him. Cursing is when a person wishes for something unpleasant to happen to another person. Cursing God is when a person speaks words or has thoughts that are against God. You may refer to the Master Glossary for more information about </w:t>
       </w:r>
-      <w:r>
-        <w:rPr>
-          <w:lang w:val="en_US" w:bidi="en_US"/>
-        </w:rPr>
-        <w:t>curse</w:t>
-      </w:r>
+      <w:hyperlink r:id="rId16">
+        <w:r>
+          <w:rPr>
+            <w:lang w:val="en_US" w:bidi="en_US"/>
+          </w:rPr>
+          <w:rPr>
+            <w:color w:val="0000EE"/>
+            <w:u w:val="single"/>
+          </w:rPr>
+          <w:t>curse</w:t>
+        </w:r>
+      </w:hyperlink>
       <w:r>
         <w:rPr>
           <w:lang w:val="en_US" w:bidi="en_US"/>
@@ -7536,7 +7662,7 @@
           <w:lang w:val="en_US" w:bidi="en_US"/>
         </w:rPr>
       </w:r>
-      <w:hyperlink r:id="rId33">
+      <w:hyperlink r:id="rId44">
         <w:r>
           <w:rPr>
             <w:lang w:val="en_US" w:bidi="en_US"/>
@@ -7571,7 +7697,7 @@
           <w:lang w:val="en_US" w:bidi="en_US"/>
         </w:rPr>
       </w:r>
-      <w:hyperlink r:id="rId34">
+      <w:hyperlink r:id="rId45">
         <w:r>
           <w:rPr>
             <w:lang w:val="en_US" w:bidi="en_US"/>
@@ -7606,7 +7732,7 @@
           <w:lang w:val="en_US" w:bidi="en_US"/>
         </w:rPr>
       </w:r>
-      <w:hyperlink r:id="rId35">
+      <w:hyperlink r:id="rId46">
         <w:r>
           <w:rPr>
             <w:lang w:val="en_US" w:bidi="en_US"/>
@@ -7641,7 +7767,7 @@
           <w:lang w:val="en_US" w:bidi="en_US"/>
         </w:rPr>
       </w:r>
-      <w:hyperlink r:id="rId36">
+      <w:hyperlink r:id="rId47">
         <w:r>
           <w:rPr>
             <w:lang w:val="en_US" w:bidi="en_US"/>
@@ -7676,7 +7802,7 @@
           <w:lang w:val="en_US" w:bidi="en_US"/>
         </w:rPr>
       </w:r>
-      <w:hyperlink r:id="rId37">
+      <w:hyperlink r:id="rId48">
         <w:r>
           <w:rPr>
             <w:lang w:val="en_US" w:bidi="en_US"/>

</xml_diff>